<commit_message>
Fix DH, Super Kendis, DPR, SPJ
</commit_message>
<xml_diff>
--- a/public/templates/2. Tanda Terima Perlengkapan SE2026.docx
+++ b/public/templates/2. Tanda Terima Perlengkapan SE2026.docx
@@ -66,7 +66,7 @@
     </w:p>
     <w:p>
       <w:pPr>
-        <w:pStyle w:val="DaftarParagraf"/>
+        <w:pStyle w:val="ListParagraph"/>
         <w:numPr>
           <w:ilvl w:val="0"/>
           <w:numId w:val="1"/>
@@ -79,16 +79,56 @@
       </w:r>
       <w:proofErr w:type="spellEnd"/>
       <w:r>
-        <w:t xml:space="preserve"> =     </w:t>
-      </w:r>
-      <w:r>
-        <w:t xml:space="preserve">2 </w:t>
+        <w:t xml:space="preserve"> </w:t>
+      </w:r>
+      <w:r>
+        <w:tab/>
+      </w:r>
+      <w:proofErr w:type="gramStart"/>
+      <w:r>
+        <w:t xml:space="preserve">=  </w:t>
+      </w:r>
+      <w:r>
+        <w:t>2</w:t>
+      </w:r>
+      <w:proofErr w:type="gramEnd"/>
+      <w:r>
+        <w:t xml:space="preserve"> </w:t>
       </w:r>
       <w:proofErr w:type="spellStart"/>
       <w:r>
         <w:t>buah</w:t>
       </w:r>
       <w:proofErr w:type="spellEnd"/>
+    </w:p>
+    <w:p>
+      <w:pPr>
+        <w:pStyle w:val="ListParagraph"/>
+        <w:numPr>
+          <w:ilvl w:val="0"/>
+          <w:numId w:val="1"/>
+        </w:numPr>
+        <w:jc w:val="both"/>
+      </w:pPr>
+      <w:proofErr w:type="spellStart"/>
+      <w:r>
+        <w:t>kuesioner</w:t>
+      </w:r>
+      <w:proofErr w:type="spellEnd"/>
+      <w:r>
+        <w:t xml:space="preserve"> </w:t>
+      </w:r>
+      <w:r>
+        <w:tab/>
+      </w:r>
+      <w:proofErr w:type="gramStart"/>
+      <w:r>
+        <w:t>=  1</w:t>
+      </w:r>
+      <w:proofErr w:type="gramEnd"/>
+      <w:r>
+        <w:t xml:space="preserve"> set</w:t>
+      </w:r>
     </w:p>
     <w:p>
       <w:pPr>
@@ -100,9 +140,11 @@
       <w:pPr>
         <w:jc w:val="both"/>
       </w:pPr>
+      <w:proofErr w:type="gramStart"/>
       <w:r>
         <w:t>Lokasi :</w:t>
       </w:r>
+      <w:proofErr w:type="gramEnd"/>
       <w:r>
         <w:t xml:space="preserve"> {</w:t>
       </w:r>
@@ -128,6 +170,7 @@
         <w:t>/</w:t>
       </w:r>
       <w:proofErr w:type="spellStart"/>
+      <w:proofErr w:type="gramStart"/>
       <w:r>
         <w:t>Kelas</w:t>
       </w:r>
@@ -135,6 +178,7 @@
       <w:r>
         <w:t xml:space="preserve"> :</w:t>
       </w:r>
+      <w:proofErr w:type="gramEnd"/>
       <w:r>
         <w:t xml:space="preserve"> {</w:t>
       </w:r>
@@ -157,7 +201,7 @@
     </w:p>
     <w:tbl>
       <w:tblPr>
-        <w:tblStyle w:val="KisiTabel"/>
+        <w:tblStyle w:val="TableGrid"/>
         <w:tblW w:w="0" w:type="auto"/>
         <w:tblLook w:val="04A0" w:firstRow="1" w:lastRow="0" w:firstColumn="1" w:lastColumn="0" w:noHBand="0" w:noVBand="1"/>
       </w:tblPr>
@@ -260,7 +304,15 @@
               <w:jc w:val="both"/>
             </w:pPr>
             <w:r>
-              <w:t>{#peserta}{no}</w:t>
+              <w:t>{#</w:t>
+            </w:r>
+            <w:proofErr w:type="gramStart"/>
+            <w:r>
+              <w:t>peserta}{</w:t>
+            </w:r>
+            <w:proofErr w:type="gramEnd"/>
+            <w:r>
+              <w:t>no}</w:t>
             </w:r>
           </w:p>
         </w:tc>
@@ -1036,11 +1088,11 @@
     <w:name w:val="Normal"/>
     <w:qFormat/>
   </w:style>
-  <w:style w:type="paragraph" w:styleId="Judul1">
+  <w:style w:type="paragraph" w:styleId="Heading1">
     <w:name w:val="heading 1"/>
     <w:basedOn w:val="Normal"/>
     <w:next w:val="Normal"/>
-    <w:link w:val="Judul1KAR"/>
+    <w:link w:val="Heading1Char"/>
     <w:uiPriority w:val="9"/>
     <w:qFormat/>
     <w:rsid w:val="00502210"/>
@@ -1057,11 +1109,11 @@
       <w:szCs w:val="40"/>
     </w:rPr>
   </w:style>
-  <w:style w:type="paragraph" w:styleId="Judul2">
+  <w:style w:type="paragraph" w:styleId="Heading2">
     <w:name w:val="heading 2"/>
     <w:basedOn w:val="Normal"/>
     <w:next w:val="Normal"/>
-    <w:link w:val="Judul2KAR"/>
+    <w:link w:val="Heading2Char"/>
     <w:uiPriority w:val="9"/>
     <w:semiHidden/>
     <w:unhideWhenUsed/>
@@ -1080,11 +1132,11 @@
       <w:szCs w:val="32"/>
     </w:rPr>
   </w:style>
-  <w:style w:type="paragraph" w:styleId="Judul3">
+  <w:style w:type="paragraph" w:styleId="Heading3">
     <w:name w:val="heading 3"/>
     <w:basedOn w:val="Normal"/>
     <w:next w:val="Normal"/>
-    <w:link w:val="Judul3KAR"/>
+    <w:link w:val="Heading3Char"/>
     <w:uiPriority w:val="9"/>
     <w:semiHidden/>
     <w:unhideWhenUsed/>
@@ -1103,11 +1155,11 @@
       <w:szCs w:val="28"/>
     </w:rPr>
   </w:style>
-  <w:style w:type="paragraph" w:styleId="Judul4">
+  <w:style w:type="paragraph" w:styleId="Heading4">
     <w:name w:val="heading 4"/>
     <w:basedOn w:val="Normal"/>
     <w:next w:val="Normal"/>
-    <w:link w:val="Judul4KAR"/>
+    <w:link w:val="Heading4Char"/>
     <w:uiPriority w:val="9"/>
     <w:semiHidden/>
     <w:unhideWhenUsed/>
@@ -1126,11 +1178,11 @@
       <w:color w:val="2F5496" w:themeColor="accent1" w:themeShade="BF"/>
     </w:rPr>
   </w:style>
-  <w:style w:type="paragraph" w:styleId="Judul5">
+  <w:style w:type="paragraph" w:styleId="Heading5">
     <w:name w:val="heading 5"/>
     <w:basedOn w:val="Normal"/>
     <w:next w:val="Normal"/>
-    <w:link w:val="Judul5KAR"/>
+    <w:link w:val="Heading5Char"/>
     <w:uiPriority w:val="9"/>
     <w:semiHidden/>
     <w:unhideWhenUsed/>
@@ -1147,11 +1199,11 @@
       <w:color w:val="2F5496" w:themeColor="accent1" w:themeShade="BF"/>
     </w:rPr>
   </w:style>
-  <w:style w:type="paragraph" w:styleId="Judul6">
+  <w:style w:type="paragraph" w:styleId="Heading6">
     <w:name w:val="heading 6"/>
     <w:basedOn w:val="Normal"/>
     <w:next w:val="Normal"/>
-    <w:link w:val="Judul6KAR"/>
+    <w:link w:val="Heading6Char"/>
     <w:uiPriority w:val="9"/>
     <w:semiHidden/>
     <w:unhideWhenUsed/>
@@ -1170,11 +1222,11 @@
       <w:color w:val="595959" w:themeColor="text1" w:themeTint="A6"/>
     </w:rPr>
   </w:style>
-  <w:style w:type="paragraph" w:styleId="Judul7">
+  <w:style w:type="paragraph" w:styleId="Heading7">
     <w:name w:val="heading 7"/>
     <w:basedOn w:val="Normal"/>
     <w:next w:val="Normal"/>
-    <w:link w:val="Judul7KAR"/>
+    <w:link w:val="Heading7Char"/>
     <w:uiPriority w:val="9"/>
     <w:semiHidden/>
     <w:unhideWhenUsed/>
@@ -1191,11 +1243,11 @@
       <w:color w:val="595959" w:themeColor="text1" w:themeTint="A6"/>
     </w:rPr>
   </w:style>
-  <w:style w:type="paragraph" w:styleId="Judul8">
+  <w:style w:type="paragraph" w:styleId="Heading8">
     <w:name w:val="heading 8"/>
     <w:basedOn w:val="Normal"/>
     <w:next w:val="Normal"/>
-    <w:link w:val="Judul8KAR"/>
+    <w:link w:val="Heading8Char"/>
     <w:uiPriority w:val="9"/>
     <w:semiHidden/>
     <w:unhideWhenUsed/>
@@ -1214,11 +1266,11 @@
       <w:color w:val="272727" w:themeColor="text1" w:themeTint="D8"/>
     </w:rPr>
   </w:style>
-  <w:style w:type="paragraph" w:styleId="Judul9">
+  <w:style w:type="paragraph" w:styleId="Heading9">
     <w:name w:val="heading 9"/>
     <w:basedOn w:val="Normal"/>
     <w:next w:val="Normal"/>
-    <w:link w:val="Judul9KAR"/>
+    <w:link w:val="Heading9Char"/>
     <w:uiPriority w:val="9"/>
     <w:semiHidden/>
     <w:unhideWhenUsed/>
@@ -1235,13 +1287,13 @@
       <w:color w:val="272727" w:themeColor="text1" w:themeTint="D8"/>
     </w:rPr>
   </w:style>
-  <w:style w:type="character" w:default="1" w:styleId="FontParagrafDefault">
+  <w:style w:type="character" w:default="1" w:styleId="DefaultParagraphFont">
     <w:name w:val="Default Paragraph Font"/>
     <w:uiPriority w:val="1"/>
     <w:semiHidden/>
     <w:unhideWhenUsed/>
   </w:style>
-  <w:style w:type="table" w:default="1" w:styleId="TabelNormal">
+  <w:style w:type="table" w:default="1" w:styleId="TableNormal">
     <w:name w:val="Normal Table"/>
     <w:uiPriority w:val="99"/>
     <w:semiHidden/>
@@ -1256,16 +1308,16 @@
       </w:tblCellMar>
     </w:tblPr>
   </w:style>
-  <w:style w:type="numbering" w:default="1" w:styleId="TidakAdaDaftar">
+  <w:style w:type="numbering" w:default="1" w:styleId="NoList">
     <w:name w:val="No List"/>
     <w:uiPriority w:val="99"/>
     <w:semiHidden/>
     <w:unhideWhenUsed/>
   </w:style>
-  <w:style w:type="character" w:customStyle="1" w:styleId="Judul1KAR">
-    <w:name w:val="Judul 1 KAR"/>
-    <w:basedOn w:val="FontParagrafDefault"/>
-    <w:link w:val="Judul1"/>
+  <w:style w:type="character" w:customStyle="1" w:styleId="Heading1Char">
+    <w:name w:val="Heading 1 Char"/>
+    <w:basedOn w:val="DefaultParagraphFont"/>
+    <w:link w:val="Heading1"/>
     <w:uiPriority w:val="9"/>
     <w:rsid w:val="00502210"/>
     <w:rPr>
@@ -1275,10 +1327,10 @@
       <w:szCs w:val="40"/>
     </w:rPr>
   </w:style>
-  <w:style w:type="character" w:customStyle="1" w:styleId="Judul2KAR">
-    <w:name w:val="Judul 2 KAR"/>
-    <w:basedOn w:val="FontParagrafDefault"/>
-    <w:link w:val="Judul2"/>
+  <w:style w:type="character" w:customStyle="1" w:styleId="Heading2Char">
+    <w:name w:val="Heading 2 Char"/>
+    <w:basedOn w:val="DefaultParagraphFont"/>
+    <w:link w:val="Heading2"/>
     <w:uiPriority w:val="9"/>
     <w:semiHidden/>
     <w:rsid w:val="00502210"/>
@@ -1289,10 +1341,10 @@
       <w:szCs w:val="32"/>
     </w:rPr>
   </w:style>
-  <w:style w:type="character" w:customStyle="1" w:styleId="Judul3KAR">
-    <w:name w:val="Judul 3 KAR"/>
-    <w:basedOn w:val="FontParagrafDefault"/>
-    <w:link w:val="Judul3"/>
+  <w:style w:type="character" w:customStyle="1" w:styleId="Heading3Char">
+    <w:name w:val="Heading 3 Char"/>
+    <w:basedOn w:val="DefaultParagraphFont"/>
+    <w:link w:val="Heading3"/>
     <w:uiPriority w:val="9"/>
     <w:semiHidden/>
     <w:rsid w:val="00502210"/>
@@ -1303,10 +1355,10 @@
       <w:szCs w:val="28"/>
     </w:rPr>
   </w:style>
-  <w:style w:type="character" w:customStyle="1" w:styleId="Judul4KAR">
-    <w:name w:val="Judul 4 KAR"/>
-    <w:basedOn w:val="FontParagrafDefault"/>
-    <w:link w:val="Judul4"/>
+  <w:style w:type="character" w:customStyle="1" w:styleId="Heading4Char">
+    <w:name w:val="Heading 4 Char"/>
+    <w:basedOn w:val="DefaultParagraphFont"/>
+    <w:link w:val="Heading4"/>
     <w:uiPriority w:val="9"/>
     <w:semiHidden/>
     <w:rsid w:val="00502210"/>
@@ -1317,10 +1369,10 @@
       <w:color w:val="2F5496" w:themeColor="accent1" w:themeShade="BF"/>
     </w:rPr>
   </w:style>
-  <w:style w:type="character" w:customStyle="1" w:styleId="Judul5KAR">
-    <w:name w:val="Judul 5 KAR"/>
-    <w:basedOn w:val="FontParagrafDefault"/>
-    <w:link w:val="Judul5"/>
+  <w:style w:type="character" w:customStyle="1" w:styleId="Heading5Char">
+    <w:name w:val="Heading 5 Char"/>
+    <w:basedOn w:val="DefaultParagraphFont"/>
+    <w:link w:val="Heading5"/>
     <w:uiPriority w:val="9"/>
     <w:semiHidden/>
     <w:rsid w:val="00502210"/>
@@ -1329,10 +1381,10 @@
       <w:color w:val="2F5496" w:themeColor="accent1" w:themeShade="BF"/>
     </w:rPr>
   </w:style>
-  <w:style w:type="character" w:customStyle="1" w:styleId="Judul6KAR">
-    <w:name w:val="Judul 6 KAR"/>
-    <w:basedOn w:val="FontParagrafDefault"/>
-    <w:link w:val="Judul6"/>
+  <w:style w:type="character" w:customStyle="1" w:styleId="Heading6Char">
+    <w:name w:val="Heading 6 Char"/>
+    <w:basedOn w:val="DefaultParagraphFont"/>
+    <w:link w:val="Heading6"/>
     <w:uiPriority w:val="9"/>
     <w:semiHidden/>
     <w:rsid w:val="00502210"/>
@@ -1343,10 +1395,10 @@
       <w:color w:val="595959" w:themeColor="text1" w:themeTint="A6"/>
     </w:rPr>
   </w:style>
-  <w:style w:type="character" w:customStyle="1" w:styleId="Judul7KAR">
-    <w:name w:val="Judul 7 KAR"/>
-    <w:basedOn w:val="FontParagrafDefault"/>
-    <w:link w:val="Judul7"/>
+  <w:style w:type="character" w:customStyle="1" w:styleId="Heading7Char">
+    <w:name w:val="Heading 7 Char"/>
+    <w:basedOn w:val="DefaultParagraphFont"/>
+    <w:link w:val="Heading7"/>
     <w:uiPriority w:val="9"/>
     <w:semiHidden/>
     <w:rsid w:val="00502210"/>
@@ -1355,10 +1407,10 @@
       <w:color w:val="595959" w:themeColor="text1" w:themeTint="A6"/>
     </w:rPr>
   </w:style>
-  <w:style w:type="character" w:customStyle="1" w:styleId="Judul8KAR">
-    <w:name w:val="Judul 8 KAR"/>
-    <w:basedOn w:val="FontParagrafDefault"/>
-    <w:link w:val="Judul8"/>
+  <w:style w:type="character" w:customStyle="1" w:styleId="Heading8Char">
+    <w:name w:val="Heading 8 Char"/>
+    <w:basedOn w:val="DefaultParagraphFont"/>
+    <w:link w:val="Heading8"/>
     <w:uiPriority w:val="9"/>
     <w:semiHidden/>
     <w:rsid w:val="00502210"/>
@@ -1369,10 +1421,10 @@
       <w:color w:val="272727" w:themeColor="text1" w:themeTint="D8"/>
     </w:rPr>
   </w:style>
-  <w:style w:type="character" w:customStyle="1" w:styleId="Judul9KAR">
-    <w:name w:val="Judul 9 KAR"/>
-    <w:basedOn w:val="FontParagrafDefault"/>
-    <w:link w:val="Judul9"/>
+  <w:style w:type="character" w:customStyle="1" w:styleId="Heading9Char">
+    <w:name w:val="Heading 9 Char"/>
+    <w:basedOn w:val="DefaultParagraphFont"/>
+    <w:link w:val="Heading9"/>
     <w:uiPriority w:val="9"/>
     <w:semiHidden/>
     <w:rsid w:val="00502210"/>
@@ -1381,11 +1433,11 @@
       <w:color w:val="272727" w:themeColor="text1" w:themeTint="D8"/>
     </w:rPr>
   </w:style>
-  <w:style w:type="paragraph" w:styleId="Judul">
+  <w:style w:type="paragraph" w:styleId="Title">
     <w:name w:val="Title"/>
     <w:basedOn w:val="Normal"/>
     <w:next w:val="Normal"/>
-    <w:link w:val="JudulKAR"/>
+    <w:link w:val="TitleChar"/>
     <w:uiPriority w:val="10"/>
     <w:qFormat/>
     <w:rsid w:val="00502210"/>
@@ -1401,10 +1453,10 @@
       <w:szCs w:val="56"/>
     </w:rPr>
   </w:style>
-  <w:style w:type="character" w:customStyle="1" w:styleId="JudulKAR">
-    <w:name w:val="Judul KAR"/>
-    <w:basedOn w:val="FontParagrafDefault"/>
-    <w:link w:val="Judul"/>
+  <w:style w:type="character" w:customStyle="1" w:styleId="TitleChar">
+    <w:name w:val="Title Char"/>
+    <w:basedOn w:val="DefaultParagraphFont"/>
+    <w:link w:val="Title"/>
     <w:uiPriority w:val="10"/>
     <w:rsid w:val="00502210"/>
     <w:rPr>
@@ -1415,11 +1467,11 @@
       <w:szCs w:val="56"/>
     </w:rPr>
   </w:style>
-  <w:style w:type="paragraph" w:styleId="Subjudul">
+  <w:style w:type="paragraph" w:styleId="Subtitle">
     <w:name w:val="Subtitle"/>
     <w:basedOn w:val="Normal"/>
     <w:next w:val="Normal"/>
-    <w:link w:val="SubjudulKAR"/>
+    <w:link w:val="SubtitleChar"/>
     <w:uiPriority w:val="11"/>
     <w:qFormat/>
     <w:rsid w:val="00502210"/>
@@ -1436,10 +1488,10 @@
       <w:szCs w:val="28"/>
     </w:rPr>
   </w:style>
-  <w:style w:type="character" w:customStyle="1" w:styleId="SubjudulKAR">
-    <w:name w:val="Subjudul KAR"/>
-    <w:basedOn w:val="FontParagrafDefault"/>
-    <w:link w:val="Subjudul"/>
+  <w:style w:type="character" w:customStyle="1" w:styleId="SubtitleChar">
+    <w:name w:val="Subtitle Char"/>
+    <w:basedOn w:val="DefaultParagraphFont"/>
+    <w:link w:val="Subtitle"/>
     <w:uiPriority w:val="11"/>
     <w:rsid w:val="00502210"/>
     <w:rPr>
@@ -1450,11 +1502,11 @@
       <w:szCs w:val="28"/>
     </w:rPr>
   </w:style>
-  <w:style w:type="paragraph" w:styleId="Kutipan">
+  <w:style w:type="paragraph" w:styleId="Quote">
     <w:name w:val="Quote"/>
     <w:basedOn w:val="Normal"/>
     <w:next w:val="Normal"/>
-    <w:link w:val="KutipanKAR"/>
+    <w:link w:val="QuoteChar"/>
     <w:uiPriority w:val="29"/>
     <w:qFormat/>
     <w:rsid w:val="00502210"/>
@@ -1468,10 +1520,10 @@
       <w:color w:val="404040" w:themeColor="text1" w:themeTint="BF"/>
     </w:rPr>
   </w:style>
-  <w:style w:type="character" w:customStyle="1" w:styleId="KutipanKAR">
-    <w:name w:val="Kutipan KAR"/>
-    <w:basedOn w:val="FontParagrafDefault"/>
-    <w:link w:val="Kutipan"/>
+  <w:style w:type="character" w:customStyle="1" w:styleId="QuoteChar">
+    <w:name w:val="Quote Char"/>
+    <w:basedOn w:val="DefaultParagraphFont"/>
+    <w:link w:val="Quote"/>
     <w:uiPriority w:val="29"/>
     <w:rsid w:val="00502210"/>
     <w:rPr>
@@ -1480,7 +1532,7 @@
       <w:color w:val="404040" w:themeColor="text1" w:themeTint="BF"/>
     </w:rPr>
   </w:style>
-  <w:style w:type="paragraph" w:styleId="DaftarParagraf">
+  <w:style w:type="paragraph" w:styleId="ListParagraph">
     <w:name w:val="List Paragraph"/>
     <w:basedOn w:val="Normal"/>
     <w:uiPriority w:val="34"/>
@@ -1491,9 +1543,9 @@
       <w:contextualSpacing/>
     </w:pPr>
   </w:style>
-  <w:style w:type="character" w:styleId="PenekananKeras">
+  <w:style w:type="character" w:styleId="IntenseEmphasis">
     <w:name w:val="Intense Emphasis"/>
-    <w:basedOn w:val="FontParagrafDefault"/>
+    <w:basedOn w:val="DefaultParagraphFont"/>
     <w:uiPriority w:val="21"/>
     <w:qFormat/>
     <w:rsid w:val="00502210"/>
@@ -1503,11 +1555,11 @@
       <w:color w:val="2F5496" w:themeColor="accent1" w:themeShade="BF"/>
     </w:rPr>
   </w:style>
-  <w:style w:type="paragraph" w:styleId="KutipanyangSering">
+  <w:style w:type="paragraph" w:styleId="IntenseQuote">
     <w:name w:val="Intense Quote"/>
     <w:basedOn w:val="Normal"/>
     <w:next w:val="Normal"/>
-    <w:link w:val="KutipanyangSeringKAR"/>
+    <w:link w:val="IntenseQuoteChar"/>
     <w:uiPriority w:val="30"/>
     <w:qFormat/>
     <w:rsid w:val="00502210"/>
@@ -1526,10 +1578,10 @@
       <w:color w:val="2F5496" w:themeColor="accent1" w:themeShade="BF"/>
     </w:rPr>
   </w:style>
-  <w:style w:type="character" w:customStyle="1" w:styleId="KutipanyangSeringKAR">
-    <w:name w:val="Kutipan yang Sering KAR"/>
-    <w:basedOn w:val="FontParagrafDefault"/>
-    <w:link w:val="KutipanyangSering"/>
+  <w:style w:type="character" w:customStyle="1" w:styleId="IntenseQuoteChar">
+    <w:name w:val="Intense Quote Char"/>
+    <w:basedOn w:val="DefaultParagraphFont"/>
+    <w:link w:val="IntenseQuote"/>
     <w:uiPriority w:val="30"/>
     <w:rsid w:val="00502210"/>
     <w:rPr>
@@ -1538,9 +1590,9 @@
       <w:color w:val="2F5496" w:themeColor="accent1" w:themeShade="BF"/>
     </w:rPr>
   </w:style>
-  <w:style w:type="character" w:styleId="ReferensiyangSering">
+  <w:style w:type="character" w:styleId="IntenseReference">
     <w:name w:val="Intense Reference"/>
-    <w:basedOn w:val="FontParagrafDefault"/>
+    <w:basedOn w:val="DefaultParagraphFont"/>
     <w:uiPriority w:val="32"/>
     <w:qFormat/>
     <w:rsid w:val="00502210"/>
@@ -1552,9 +1604,9 @@
       <w:spacing w:val="5"/>
     </w:rPr>
   </w:style>
-  <w:style w:type="table" w:styleId="KisiTabel">
+  <w:style w:type="table" w:styleId="TableGrid">
     <w:name w:val="Table Grid"/>
-    <w:basedOn w:val="TabelNormal"/>
+    <w:basedOn w:val="TableNormal"/>
     <w:uiPriority w:val="39"/>
     <w:rsid w:val="00502210"/>
     <w:pPr>

</xml_diff>

<commit_message>
Fix Template Surat Terima
</commit_message>
<xml_diff>
--- a/public/templates/2. Tanda Terima Perlengkapan SE2026.docx
+++ b/public/templates/2. Tanda Terima Perlengkapan SE2026.docx
@@ -73,45 +73,95 @@
         </w:numPr>
         <w:jc w:val="both"/>
       </w:pPr>
+      <w:proofErr w:type="spellStart"/>
       <w:r>
         <w:t>pulpen</w:t>
       </w:r>
+      <w:proofErr w:type="spellEnd"/>
       <w:r>
         <w:t xml:space="preserve"> </w:t>
       </w:r>
       <w:r>
         <w:tab/>
       </w:r>
+      <w:proofErr w:type="gramStart"/>
       <w:r>
         <w:t xml:space="preserve">=  </w:t>
       </w:r>
       <w:r>
-        <w:t xml:space="preserve">2 </w:t>
-      </w:r>
+        <w:t>2</w:t>
+      </w:r>
+      <w:proofErr w:type="gramEnd"/>
+      <w:r>
+        <w:t xml:space="preserve"> </w:t>
+      </w:r>
+      <w:proofErr w:type="spellStart"/>
       <w:r>
         <w:t>buah</w:t>
       </w:r>
+      <w:proofErr w:type="spellEnd"/>
     </w:p>
     <w:p>
       <w:pPr>
         <w:jc w:val="both"/>
       </w:pPr>
+      <w:proofErr w:type="gramStart"/>
       <w:r>
         <w:t>Lokasi :</w:t>
       </w:r>
-      <w:r>
-        <w:t xml:space="preserve"> {tempat}</w:t>
+      <w:proofErr w:type="gramEnd"/>
+      <w:r>
+        <w:t xml:space="preserve"> {</w:t>
+      </w:r>
+      <w:proofErr w:type="spellStart"/>
+      <w:r>
+        <w:t>tempat</w:t>
+      </w:r>
+      <w:proofErr w:type="spellEnd"/>
+      <w:r>
+        <w:t>}</w:t>
       </w:r>
     </w:p>
     <w:p>
       <w:pPr>
         <w:jc w:val="both"/>
       </w:pPr>
-      <w:r>
-        <w:t>Gelombang/Kelas :</w:t>
-      </w:r>
-      <w:r>
-        <w:t xml:space="preserve"> {gelombang} / {kelas}</w:t>
+      <w:proofErr w:type="spellStart"/>
+      <w:r>
+        <w:t>Gelombang</w:t>
+      </w:r>
+      <w:proofErr w:type="spellEnd"/>
+      <w:r>
+        <w:t>/</w:t>
+      </w:r>
+      <w:proofErr w:type="spellStart"/>
+      <w:proofErr w:type="gramStart"/>
+      <w:r>
+        <w:t>Kelas</w:t>
+      </w:r>
+      <w:proofErr w:type="spellEnd"/>
+      <w:r>
+        <w:t xml:space="preserve"> :</w:t>
+      </w:r>
+      <w:proofErr w:type="gramEnd"/>
+      <w:r>
+        <w:t xml:space="preserve"> {</w:t>
+      </w:r>
+      <w:proofErr w:type="spellStart"/>
+      <w:r>
+        <w:t>gelombang</w:t>
+      </w:r>
+      <w:proofErr w:type="spellEnd"/>
+      <w:r>
+        <w:t>} / {</w:t>
+      </w:r>
+      <w:proofErr w:type="spellStart"/>
+      <w:r>
+        <w:t>kelas</w:t>
+      </w:r>
+      <w:proofErr w:type="spellEnd"/>
+      <w:r>
+        <w:t>}</w:t>
       </w:r>
     </w:p>
     <w:tbl>
@@ -121,16 +171,16 @@
         <w:tblLook w:val="04A0" w:firstRow="1" w:lastRow="0" w:firstColumn="1" w:lastColumn="0" w:noHBand="0" w:noVBand="1"/>
       </w:tblPr>
       <w:tblGrid>
-        <w:gridCol w:w="1625"/>
-        <w:gridCol w:w="1921"/>
-        <w:gridCol w:w="1932"/>
-        <w:gridCol w:w="1952"/>
-        <w:gridCol w:w="1920"/>
+        <w:gridCol w:w="1222"/>
+        <w:gridCol w:w="2456"/>
+        <w:gridCol w:w="1879"/>
+        <w:gridCol w:w="1919"/>
+        <w:gridCol w:w="1874"/>
       </w:tblGrid>
       <w:tr>
         <w:tc>
           <w:tcPr>
-            <w:tcW w:w="1625" w:type="dxa"/>
+            <w:tcW w:w="985" w:type="dxa"/>
           </w:tcPr>
           <w:p>
             <w:pPr>
@@ -143,7 +193,7 @@
         </w:tc>
         <w:tc>
           <w:tcPr>
-            <w:tcW w:w="1921" w:type="dxa"/>
+            <w:tcW w:w="2561" w:type="dxa"/>
           </w:tcPr>
           <w:p>
             <w:pPr>
@@ -162,9 +212,11 @@
             <w:pPr>
               <w:jc w:val="center"/>
             </w:pPr>
+            <w:proofErr w:type="spellStart"/>
             <w:r>
               <w:t>Jabatan</w:t>
             </w:r>
+            <w:proofErr w:type="spellEnd"/>
           </w:p>
         </w:tc>
         <w:tc>
@@ -175,9 +227,11 @@
             <w:pPr>
               <w:jc w:val="center"/>
             </w:pPr>
+            <w:proofErr w:type="spellStart"/>
             <w:r>
               <w:t>Kecamatan</w:t>
             </w:r>
+            <w:proofErr w:type="spellEnd"/>
           </w:p>
         </w:tc>
         <w:tc>
@@ -189,11 +243,16 @@
               <w:jc w:val="center"/>
             </w:pPr>
             <w:r>
-              <w:t>Tanda tanga</w:t>
+              <w:t xml:space="preserve">Tanda </w:t>
+            </w:r>
+            <w:proofErr w:type="spellStart"/>
+            <w:r>
+              <w:t>tanga</w:t>
             </w:r>
             <w:r>
               <w:t>n</w:t>
             </w:r>
+            <w:proofErr w:type="spellEnd"/>
           </w:p>
         </w:tc>
       </w:tr>
@@ -203,20 +262,28 @@
         </w:trPr>
         <w:tc>
           <w:tcPr>
-            <w:tcW w:w="1625" w:type="dxa"/>
+            <w:tcW w:w="985" w:type="dxa"/>
           </w:tcPr>
           <w:p>
             <w:pPr>
               <w:jc w:val="both"/>
             </w:pPr>
             <w:r>
-              <w:t>{#peserta}{no}</w:t>
+              <w:t>{#peserta}</w:t>
+            </w:r>
+          </w:p>
+          <w:p>
+            <w:pPr>
+              <w:jc w:val="both"/>
+            </w:pPr>
+            <w:r>
+              <w:t>{no}</w:t>
             </w:r>
           </w:p>
         </w:tc>
         <w:tc>
           <w:tcPr>
-            <w:tcW w:w="1921" w:type="dxa"/>
+            <w:tcW w:w="2561" w:type="dxa"/>
           </w:tcPr>
           <w:p>
             <w:pPr>
@@ -236,7 +303,15 @@
               <w:jc w:val="both"/>
             </w:pPr>
             <w:r>
-              <w:t>{jabatan}</w:t>
+              <w:t>{</w:t>
+            </w:r>
+            <w:proofErr w:type="spellStart"/>
+            <w:r>
+              <w:t>jabatan</w:t>
+            </w:r>
+            <w:proofErr w:type="spellEnd"/>
+            <w:r>
+              <w:t>}</w:t>
             </w:r>
           </w:p>
         </w:tc>
@@ -249,7 +324,15 @@
               <w:jc w:val="both"/>
             </w:pPr>
             <w:r>
-              <w:t>{kecamatan}</w:t>
+              <w:t>{</w:t>
+            </w:r>
+            <w:proofErr w:type="spellStart"/>
+            <w:r>
+              <w:t>kecamatan</w:t>
+            </w:r>
+            <w:proofErr w:type="spellEnd"/>
+            <w:r>
+              <w:t>}</w:t>
             </w:r>
           </w:p>
         </w:tc>
@@ -262,7 +345,15 @@
               <w:jc w:val="both"/>
             </w:pPr>
             <w:r>
-              <w:t>{/peserta}</w:t>
+              <w:t>{/</w:t>
+            </w:r>
+            <w:proofErr w:type="spellStart"/>
+            <w:r>
+              <w:t>peserta</w:t>
+            </w:r>
+            <w:proofErr w:type="spellEnd"/>
+            <w:r>
+              <w:t>}</w:t>
             </w:r>
           </w:p>
         </w:tc>
@@ -316,7 +407,15 @@
         <w:t>Jakarta,</w:t>
       </w:r>
       <w:r>
-        <w:t xml:space="preserve"> {tanggal_kegiatan}</w:t>
+        <w:t xml:space="preserve"> {</w:t>
+      </w:r>
+      <w:proofErr w:type="spellStart"/>
+      <w:r>
+        <w:t>tanggal_kegiatan</w:t>
+      </w:r>
+      <w:proofErr w:type="spellEnd"/>
+      <w:r>
+        <w:t>}</w:t>
       </w:r>
     </w:p>
     <w:p>
@@ -344,8 +443,13 @@
       </w:r>
       <w:r>
         <w:tab/>
-        <w:t xml:space="preserve">             Mengetahui</w:t>
-      </w:r>
+        <w:t xml:space="preserve">             </w:t>
+      </w:r>
+      <w:proofErr w:type="spellStart"/>
+      <w:r>
+        <w:t>Mengetahui</w:t>
+      </w:r>
+      <w:proofErr w:type="spellEnd"/>
     </w:p>
     <w:p>
       <w:pPr>
@@ -372,7 +476,14 @@
       </w:r>
       <w:r>
         <w:tab/>
-        <w:t>Kepala Sub Bagian Umum</w:t>
+      </w:r>
+      <w:proofErr w:type="spellStart"/>
+      <w:r>
+        <w:t>Kepala</w:t>
+      </w:r>
+      <w:proofErr w:type="spellEnd"/>
+      <w:r>
+        <w:t xml:space="preserve"> Sub Bagian Umum</w:t>
       </w:r>
     </w:p>
     <w:p>
@@ -413,7 +524,15 @@
         <w:jc w:val="both"/>
       </w:pPr>
       <w:r>
-        <w:t xml:space="preserve">           Ir. Tristiati, MA</w:t>
+        <w:t xml:space="preserve">           Ir. </w:t>
+      </w:r>
+      <w:proofErr w:type="spellStart"/>
+      <w:r>
+        <w:t>Tristiati</w:t>
+      </w:r>
+      <w:proofErr w:type="spellEnd"/>
+      <w:r>
+        <w:t>, MA</w:t>
       </w:r>
     </w:p>
     <w:p>

</xml_diff>

<commit_message>
Fix Template Surat Terima vfix
</commit_message>
<xml_diff>
--- a/public/templates/2. Tanda Terima Perlengkapan SE2026.docx
+++ b/public/templates/2. Tanda Terima Perlengkapan SE2026.docx
@@ -167,11 +167,11 @@
         <w:tblLook w:val="04A0" w:firstRow="1" w:lastRow="0" w:firstColumn="1" w:lastColumn="0" w:noHBand="0" w:noVBand="1"/>
       </w:tblPr>
       <w:tblGrid>
-        <w:gridCol w:w="1872"/>
-        <w:gridCol w:w="1872"/>
-        <w:gridCol w:w="1872"/>
-        <w:gridCol w:w="1872"/>
-        <w:gridCol w:w="1872"/>
+        <w:gridCol w:w="1222"/>
+        <w:gridCol w:w="3003"/>
+        <w:gridCol w:w="1409"/>
+        <w:gridCol w:w="1865"/>
+        <w:gridCol w:w="1861"/>
       </w:tblGrid>
       <w:tr>
         <w:trPr>
@@ -179,7 +179,7 @@
         </w:trPr>
         <w:tc>
           <w:tcPr>
-            <w:tcW w:w="1872" w:type="dxa"/>
+            <w:tcW w:w="1222" w:type="dxa"/>
             <w:vAlign w:val="center"/>
           </w:tcPr>
           <w:p>
@@ -193,7 +193,7 @@
         </w:tc>
         <w:tc>
           <w:tcPr>
-            <w:tcW w:w="1872" w:type="dxa"/>
+            <w:tcW w:w="3003" w:type="dxa"/>
             <w:vAlign w:val="center"/>
           </w:tcPr>
           <w:p>
@@ -207,7 +207,7 @@
         </w:tc>
         <w:tc>
           <w:tcPr>
-            <w:tcW w:w="1872" w:type="dxa"/>
+            <w:tcW w:w="1409" w:type="dxa"/>
             <w:vAlign w:val="center"/>
           </w:tcPr>
           <w:p>
@@ -223,7 +223,7 @@
         </w:tc>
         <w:tc>
           <w:tcPr>
-            <w:tcW w:w="1872" w:type="dxa"/>
+            <w:tcW w:w="1865" w:type="dxa"/>
             <w:vAlign w:val="center"/>
           </w:tcPr>
           <w:p>
@@ -239,7 +239,7 @@
         </w:tc>
         <w:tc>
           <w:tcPr>
-            <w:tcW w:w="1872" w:type="dxa"/>
+            <w:tcW w:w="1861" w:type="dxa"/>
             <w:vAlign w:val="center"/>
           </w:tcPr>
           <w:p>
@@ -266,7 +266,7 @@
         </w:trPr>
         <w:tc>
           <w:tcPr>
-            <w:tcW w:w="1872" w:type="dxa"/>
+            <w:tcW w:w="1222" w:type="dxa"/>
             <w:vAlign w:val="center"/>
           </w:tcPr>
           <w:p>
@@ -288,7 +288,7 @@
         </w:tc>
         <w:tc>
           <w:tcPr>
-            <w:tcW w:w="1872" w:type="dxa"/>
+            <w:tcW w:w="3003" w:type="dxa"/>
             <w:vAlign w:val="center"/>
           </w:tcPr>
           <w:p>
@@ -302,7 +302,7 @@
         </w:tc>
         <w:tc>
           <w:tcPr>
-            <w:tcW w:w="1872" w:type="dxa"/>
+            <w:tcW w:w="1409" w:type="dxa"/>
             <w:vAlign w:val="center"/>
           </w:tcPr>
           <w:p>
@@ -324,7 +324,7 @@
         </w:tc>
         <w:tc>
           <w:tcPr>
-            <w:tcW w:w="1872" w:type="dxa"/>
+            <w:tcW w:w="1865" w:type="dxa"/>
             <w:vAlign w:val="center"/>
           </w:tcPr>
           <w:p>
@@ -346,7 +346,7 @@
         </w:tc>
         <w:tc>
           <w:tcPr>
-            <w:tcW w:w="1872" w:type="dxa"/>
+            <w:tcW w:w="1861" w:type="dxa"/>
             <w:vAlign w:val="center"/>
           </w:tcPr>
           <w:p>

</xml_diff>

<commit_message>
Fix Template Surat Terima vfixx
</commit_message>
<xml_diff>
--- a/public/templates/2. Tanda Terima Perlengkapan SE2026.docx
+++ b/public/templates/2. Tanda Terima Perlengkapan SE2026.docx
@@ -167,11 +167,11 @@
         <w:tblLook w:val="04A0" w:firstRow="1" w:lastRow="0" w:firstColumn="1" w:lastColumn="0" w:noHBand="0" w:noVBand="1"/>
       </w:tblPr>
       <w:tblGrid>
-        <w:gridCol w:w="1222"/>
-        <w:gridCol w:w="3003"/>
-        <w:gridCol w:w="1409"/>
-        <w:gridCol w:w="1865"/>
-        <w:gridCol w:w="1861"/>
+        <w:gridCol w:w="1625"/>
+        <w:gridCol w:w="3127"/>
+        <w:gridCol w:w="1293"/>
+        <w:gridCol w:w="1702"/>
+        <w:gridCol w:w="1613"/>
       </w:tblGrid>
       <w:tr>
         <w:trPr>
@@ -179,7 +179,7 @@
         </w:trPr>
         <w:tc>
           <w:tcPr>
-            <w:tcW w:w="1222" w:type="dxa"/>
+            <w:tcW w:w="355" w:type="dxa"/>
             <w:vAlign w:val="center"/>
           </w:tcPr>
           <w:p>
@@ -193,7 +193,7 @@
         </w:tc>
         <w:tc>
           <w:tcPr>
-            <w:tcW w:w="3003" w:type="dxa"/>
+            <w:tcW w:w="4033" w:type="dxa"/>
             <w:vAlign w:val="center"/>
           </w:tcPr>
           <w:p>
@@ -207,7 +207,7 @@
         </w:tc>
         <w:tc>
           <w:tcPr>
-            <w:tcW w:w="1409" w:type="dxa"/>
+            <w:tcW w:w="1373" w:type="dxa"/>
             <w:vAlign w:val="center"/>
           </w:tcPr>
           <w:p>
@@ -223,7 +223,7 @@
         </w:tc>
         <w:tc>
           <w:tcPr>
-            <w:tcW w:w="1865" w:type="dxa"/>
+            <w:tcW w:w="1815" w:type="dxa"/>
             <w:vAlign w:val="center"/>
           </w:tcPr>
           <w:p>
@@ -239,7 +239,7 @@
         </w:tc>
         <w:tc>
           <w:tcPr>
-            <w:tcW w:w="1861" w:type="dxa"/>
+            <w:tcW w:w="1784" w:type="dxa"/>
             <w:vAlign w:val="center"/>
           </w:tcPr>
           <w:p>
@@ -266,7 +266,7 @@
         </w:trPr>
         <w:tc>
           <w:tcPr>
-            <w:tcW w:w="1222" w:type="dxa"/>
+            <w:tcW w:w="355" w:type="dxa"/>
             <w:vAlign w:val="center"/>
           </w:tcPr>
           <w:p>
@@ -274,21 +274,21 @@
               <w:jc w:val="center"/>
             </w:pPr>
             <w:r>
-              <w:t>{#peserta}</w:t>
+              <w:t>{#</w:t>
             </w:r>
-          </w:p>
-          <w:p>
-            <w:pPr>
-              <w:jc w:val="center"/>
-            </w:pPr>
+            <w:proofErr w:type="gramStart"/>
             <w:r>
-              <w:t>{no}</w:t>
+              <w:t>peserta}{</w:t>
+            </w:r>
+            <w:proofErr w:type="gramEnd"/>
+            <w:r>
+              <w:t>no}</w:t>
             </w:r>
           </w:p>
         </w:tc>
         <w:tc>
           <w:tcPr>
-            <w:tcW w:w="3003" w:type="dxa"/>
+            <w:tcW w:w="4033" w:type="dxa"/>
             <w:vAlign w:val="center"/>
           </w:tcPr>
           <w:p>
@@ -302,7 +302,7 @@
         </w:tc>
         <w:tc>
           <w:tcPr>
-            <w:tcW w:w="1409" w:type="dxa"/>
+            <w:tcW w:w="1373" w:type="dxa"/>
             <w:vAlign w:val="center"/>
           </w:tcPr>
           <w:p>
@@ -324,7 +324,7 @@
         </w:tc>
         <w:tc>
           <w:tcPr>
-            <w:tcW w:w="1865" w:type="dxa"/>
+            <w:tcW w:w="1815" w:type="dxa"/>
             <w:vAlign w:val="center"/>
           </w:tcPr>
           <w:p>
@@ -346,7 +346,7 @@
         </w:tc>
         <w:tc>
           <w:tcPr>
-            <w:tcW w:w="1861" w:type="dxa"/>
+            <w:tcW w:w="1784" w:type="dxa"/>
             <w:vAlign w:val="center"/>
           </w:tcPr>
           <w:p>

</xml_diff>

<commit_message>
Fix Template Surat Terima vfixxx
</commit_message>
<xml_diff>
--- a/public/templates/2. Tanda Terima Perlengkapan SE2026.docx
+++ b/public/templates/2. Tanda Terima Perlengkapan SE2026.docx
@@ -372,24 +372,57 @@
       <w:pPr>
         <w:jc w:val="both"/>
       </w:pPr>
+      <w:r>
+        <w:tab/>
+      </w:r>
     </w:p>
     <w:p>
       <w:pPr>
+        <w:spacing w:after="0" w:line="240" w:lineRule="auto"/>
         <w:jc w:val="both"/>
       </w:pPr>
+      <w:r>
+        <w:tab/>
+      </w:r>
+      <w:r>
+        <w:tab/>
+      </w:r>
+      <w:r>
+        <w:tab/>
+      </w:r>
+      <w:r>
+        <w:tab/>
+      </w:r>
+      <w:r>
+        <w:tab/>
+      </w:r>
+      <w:r>
+        <w:tab/>
+      </w:r>
+      <w:r>
+        <w:tab/>
+      </w:r>
+      <w:r>
+        <w:tab/>
+      </w:r>
+      <w:r>
+        <w:tab/>
+        <w:t>Jakarta,</w:t>
+      </w:r>
+      <w:r>
+        <w:t xml:space="preserve"> {</w:t>
+      </w:r>
+      <w:proofErr w:type="spellStart"/>
+      <w:r>
+        <w:t>tanggal_kegiatan</w:t>
+      </w:r>
+      <w:proofErr w:type="spellEnd"/>
+      <w:r>
+        <w:t>}</w:t>
+      </w:r>
     </w:p>
     <w:p>
       <w:pPr>
-        <w:jc w:val="both"/>
-      </w:pPr>
-    </w:p>
-    <w:p>
-      <w:pPr>
-        <w:jc w:val="both"/>
-      </w:pPr>
-    </w:p>
-    <w:p>
-      <w:pPr>
         <w:spacing w:after="0" w:line="240" w:lineRule="auto"/>
         <w:jc w:val="both"/>
       </w:pPr>
@@ -399,39 +432,6 @@
       <w:r>
         <w:tab/>
       </w:r>
-      <w:r>
-        <w:tab/>
-      </w:r>
-      <w:r>
-        <w:tab/>
-      </w:r>
-      <w:r>
-        <w:tab/>
-      </w:r>
-      <w:r>
-        <w:tab/>
-      </w:r>
-      <w:r>
-        <w:tab/>
-        <w:t>Jakarta,</w:t>
-      </w:r>
-      <w:r>
-        <w:t xml:space="preserve"> {</w:t>
-      </w:r>
-      <w:proofErr w:type="spellStart"/>
-      <w:r>
-        <w:t>tanggal_kegiatan</w:t>
-      </w:r>
-      <w:proofErr w:type="spellEnd"/>
-      <w:r>
-        <w:t>}</w:t>
-      </w:r>
-    </w:p>
-    <w:p>
-      <w:pPr>
-        <w:spacing w:after="0" w:line="240" w:lineRule="auto"/>
-        <w:jc w:val="both"/>
-      </w:pPr>
       <w:r>
         <w:tab/>
       </w:r>
@@ -486,6 +486,12 @@
       <w:r>
         <w:tab/>
       </w:r>
+      <w:r>
+        <w:tab/>
+      </w:r>
+      <w:r>
+        <w:tab/>
+      </w:r>
       <w:proofErr w:type="spellStart"/>
       <w:r>
         <w:t>Kepala</w:t>
@@ -493,6 +499,16 @@
       <w:proofErr w:type="spellEnd"/>
       <w:r>
         <w:t xml:space="preserve"> Sub Bagian Umum</w:t>
+      </w:r>
+    </w:p>
+    <w:p>
+      <w:pPr>
+        <w:spacing w:after="0" w:line="240" w:lineRule="auto"/>
+        <w:ind w:left="5760" w:firstLine="720"/>
+        <w:jc w:val="both"/>
+      </w:pPr>
+      <w:r>
+        <w:t xml:space="preserve">   BPS Kota Jakarta Timur</w:t>
       </w:r>
     </w:p>
     <w:p>
@@ -501,9 +517,6 @@
         <w:ind w:left="4320" w:firstLine="720"/>
         <w:jc w:val="both"/>
       </w:pPr>
-      <w:r>
-        <w:t xml:space="preserve">   BPS Kota Jakarta Timur</w:t>
-      </w:r>
     </w:p>
     <w:p>
       <w:pPr>
@@ -525,6 +538,27 @@
         <w:ind w:left="4320" w:firstLine="720"/>
         <w:jc w:val="both"/>
       </w:pPr>
+      <w:r>
+        <w:t xml:space="preserve">           </w:t>
+      </w:r>
+      <w:r>
+        <w:tab/>
+      </w:r>
+      <w:r>
+        <w:tab/>
+        <w:t xml:space="preserve">           </w:t>
+      </w:r>
+      <w:r>
+        <w:t>Ir. T</w:t>
+      </w:r>
+      <w:proofErr w:type="spellStart"/>
+      <w:r>
+        <w:t>ristiati</w:t>
+      </w:r>
+      <w:proofErr w:type="spellEnd"/>
+      <w:r>
+        <w:t>, MA</w:t>
+      </w:r>
     </w:p>
     <w:p>
       <w:pPr>
@@ -533,25 +567,16 @@
         <w:jc w:val="both"/>
       </w:pPr>
       <w:r>
-        <w:t xml:space="preserve">           Ir. </w:t>
-      </w:r>
-      <w:proofErr w:type="spellStart"/>
-      <w:r>
-        <w:t>Tristiati</w:t>
-      </w:r>
-      <w:proofErr w:type="spellEnd"/>
-      <w:r>
-        <w:t>, MA</w:t>
-      </w:r>
-    </w:p>
-    <w:p>
-      <w:pPr>
-        <w:spacing w:after="0" w:line="240" w:lineRule="auto"/>
-        <w:ind w:left="4320" w:firstLine="720"/>
-        <w:jc w:val="both"/>
-      </w:pPr>
-      <w:r>
-        <w:t xml:space="preserve"> NIP. 196902121994032002</w:t>
+        <w:t xml:space="preserve"> </w:t>
+      </w:r>
+      <w:r>
+        <w:tab/>
+      </w:r>
+      <w:r>
+        <w:tab/>
+      </w:r>
+      <w:r>
+        <w:t>NIP. 196902121994032002</w:t>
       </w:r>
     </w:p>
     <w:sectPr>

</xml_diff>

<commit_message>
Fix Tanggal dan Template
</commit_message>
<xml_diff>
--- a/public/templates/2. Tanda Terima Perlengkapan SE2026.docx
+++ b/public/templates/2. Tanda Terima Perlengkapan SE2026.docx
@@ -84,16 +84,11 @@
       <w:r>
         <w:tab/>
       </w:r>
-      <w:proofErr w:type="gramStart"/>
       <w:r>
         <w:t xml:space="preserve">=  </w:t>
       </w:r>
       <w:r>
-        <w:t>2</w:t>
-      </w:r>
-      <w:proofErr w:type="gramEnd"/>
-      <w:r>
-        <w:t xml:space="preserve"> </w:t>
+        <w:t xml:space="preserve">2 </w:t>
       </w:r>
       <w:proofErr w:type="spellStart"/>
       <w:r>
@@ -274,15 +269,7 @@
               <w:jc w:val="center"/>
             </w:pPr>
             <w:r>
-              <w:t>{#</w:t>
-            </w:r>
-            <w:proofErr w:type="gramStart"/>
-            <w:r>
-              <w:t>peserta}{</w:t>
-            </w:r>
-            <w:proofErr w:type="gramEnd"/>
-            <w:r>
-              <w:t>no}</w:t>
+              <w:t>{#peserta}{no}</w:t>
             </w:r>
           </w:p>
         </w:tc>
@@ -414,7 +401,10 @@
       </w:r>
       <w:proofErr w:type="spellStart"/>
       <w:r>
-        <w:t>tanggal_kegiatan</w:t>
+        <w:t>tanggal_</w:t>
+      </w:r>
+      <w:r>
+        <w:t>aja</w:t>
       </w:r>
       <w:proofErr w:type="spellEnd"/>
       <w:r>
@@ -549,11 +539,11 @@
         <w:t xml:space="preserve">           </w:t>
       </w:r>
       <w:r>
-        <w:t>Ir. T</w:t>
+        <w:t xml:space="preserve">Ir. </w:t>
       </w:r>
       <w:proofErr w:type="spellStart"/>
       <w:r>
-        <w:t>ristiati</w:t>
+        <w:t>Tristiati</w:t>
       </w:r>
       <w:proofErr w:type="spellEnd"/>
       <w:r>

</xml_diff>